<commit_message>
the supplement is the senior author's 2026-09-21 revision without what the paper dropped: his S1 (the similarity judge) is gone and S2-S13 are S1-S12, M10 defines the two retrieval metrics with the importance-weighted cosine written out, S6 reports plain cosine at k = 50 against the sweep and both leading classifiers with the fusion analysis removed because it rested on uniform weighting, the history-length quintiles are the cosine arm, and S9 is the recomputed 240-contrast subgroup set with the importance-weighted arm as the retrieval row. The subgroup forest plot drew no retrieval points because its representative was still NEAREST_LLM; run_subgroups.py names NEAREST_WEIGHTED and --replot redraws tables and figure from the saved CSVs. The manuscript's supplement pointers follow the new numbering.
</commit_message>
<xml_diff>
--- a/research/TRD-EHR/paper1-trd-prediction/manuscript.docx
+++ b/research/TRD-EHR/paper1-trd-prediction/manuscript.docx
@@ -520,7 +520,7 @@
         <w:pStyle w:val="BodyText"/>
       </w:pPr>
       <w:r>
-        <w:t xml:space="preserve">The pipelines differed in information content. Narratives retained vital signs, individual medication names, index dates, sexual orientation, and finer sociodemographic categories; FEATURE included total recorded history length, which the narratives omitted. Missing vital signs were excluded from FEATURE, and no statistical imputation was used in the primary analysis. Missing categorical information was represented explicitly, although some narrative fields retained raw missing-value tokens. Encoding rules, the predictor inventory, example narratives, and the field crosswalk are provided in Multimedia Appendix 1, sections M4–M6, S6, and S11.</w:t>
+        <w:t xml:space="preserve">The pipelines differed in information content. Narratives retained vital signs, individual medication names, index dates, sexual orientation, and finer sociodemographic categories; FEATURE included total recorded history length, which the narratives omitted. Missing vital signs were excluded from FEATURE, and no statistical imputation was used in the primary analysis. Missing categorical information was represented explicitly, although some narrative fields retained raw missing-value tokens. Encoding rules, the predictor inventory, example narratives, and the field crosswalk are provided in Multimedia Appendix 1, sections M4–M6, S5, and S10.</w:t>
       </w:r>
     </w:p>
     <w:bookmarkEnd w:id="29"/>
@@ -554,7 +554,7 @@
         <w:pStyle w:val="BodyText"/>
       </w:pPr>
       <w:r>
-        <w:t xml:space="preserve">Nonparametric bootstrap resampling of test patients provided 95% CIs. Paired resampling estimated differences between representations and between original and perturbed predictions. Classifier-matched contrasts held the learner fixed. The comparison of the best model for each representation was post hoc because the leading models were identified from test performance. No equivalence margin was prespecified; a CI containing zero does not establish equivalence. Sensitivity and specificity at test-selected Youden J thresholds are reported only as descriptive analyses in Multimedia Appendix 1, section S13.</w:t>
+        <w:t xml:space="preserve">Nonparametric bootstrap resampling of test patients provided 95% CIs. Paired resampling estimated differences between representations and between original and perturbed predictions. Classifier-matched contrasts held the learner fixed. The comparison of the best model for each representation was post hoc because the leading models were identified from test performance. No equivalence margin was prespecified; a CI containing zero does not establish equivalence. Sensitivity and specificity at test-selected Youden J thresholds are reported only as descriptive analyses in Multimedia Appendix 1, section S12.</w:t>
       </w:r>
     </w:p>
     <w:bookmarkEnd w:id="30"/>
@@ -1512,7 +1512,7 @@
         <w:t xml:space="preserve"> </w:t>
       </w:r>
       <w:r>
-        <w:t xml:space="preserve">is a sharpening exponent. Plain cosine similarity is Equation 1 with raw embeddings and equal weights. The primary analysis used k = 50 and α = 5. A sweep evaluated every k from 1 to all 34,063 training patients, under α = 1, 2, and 5. Random and farthest retrieval served as negative controls. Details appear in Multimedia Appendix 1, sections M10–M12 and S7.</w:t>
+        <w:t xml:space="preserve">is a sharpening exponent. Plain cosine similarity is Equation 1 with raw embeddings and equal weights. The primary analysis used k = 50 and α = 5. A sweep evaluated every k from 1 to all 34,063 training patients, under α = 1, 2, and 5. Random and farthest retrieval served as negative controls. Details appear in Multimedia Appendix 1, sections M10–M12 and S6.</w:t>
       </w:r>
     </w:p>
     <w:p>
@@ -1566,7 +1566,7 @@
         <w:pStyle w:val="FirstParagraph"/>
       </w:pPr>
       <w:r>
-        <w:t xml:space="preserve">Of 501,718 patients in the extract, 42,579 met eligibility criteria and 7,455 (17.5%) met the TRD proxy definition. Median age was 55 years (IQR 38–70); 72.5% were female, 80.0% were recorded as White/Caucasian, and 98.9% preferred English. Outcome-positive patients more often had coded suicidality, severe depression, anxiety, insomnia, and substance use disorders (Table 1). Expanded characteristics and subgroup outcome frequencies are in Multimedia Appendix 1, section S12.</w:t>
+        <w:t xml:space="preserve">Of 501,718 patients in the extract, 42,579 met eligibility criteria and 7,455 (17.5%) met the TRD proxy definition. Median age was 55 years (IQR 38–70); 72.5% were female, 80.0% were recorded as White/Caucasian, and 98.9% preferred English. Outcome-positive patients more often had coded suicidality, severe depression, anxiety, insomnia, and substance use disorders (Table 1). Expanded characteristics and subgroup outcome frequencies are in Multimedia Appendix 1, section S11.</w:t>
       </w:r>
     </w:p>
     <w:p>
@@ -1594,7 +1594,7 @@
           <w:iCs/>
           <w:i/>
         </w:rPr>
-        <w:t xml:space="preserve">Selected cohort characteristics by TRD proxy status. Values are median (IQR) or n (%). SMD is the standardized mean difference between positive and negative groups. MDD: major depressive disorder; PTSD: posttraumatic stress disorder. Expanded characteristics appear in Multimedia Appendix 1, Table S15.</w:t>
+        <w:t xml:space="preserve">Selected cohort characteristics by TRD proxy status. Values are median (IQR) or n (%). SMD is the standardized mean difference between positive and negative groups. MDD: major depressive disorder; PTSD: posttraumatic stress disorder. Expanded characteristics appear in Multimedia Appendix 1, Table S14.</w:t>
       </w:r>
     </w:p>
     <w:tbl>
@@ -2603,7 +2603,7 @@
         <w:pStyle w:val="BodyText"/>
       </w:pPr>
       <w:r>
-        <w:t xml:space="preserve">Training and test characteristics were closely balanced (maximum absolute standardized mean difference 0.036). Weak negative correlations linked the outcome to history length, encounter count, and time from depression diagnosis to the index prescription. These descriptive checks do not exclude effects of observation or care access (Multimedia Appendix 1, sections S8–S9).</w:t>
+        <w:t xml:space="preserve">Training and test characteristics were closely balanced (maximum absolute standardized mean difference 0.036). Weak negative correlations linked the outcome to history length, encounter count, and time from depression diagnosis to the index prescription. These descriptive checks do not exclude effects of observation or care access (Multimedia Appendix 1, sections S7–S8).</w:t>
       </w:r>
     </w:p>
     <w:bookmarkEnd w:id="34"/>
@@ -3261,7 +3261,7 @@
         <w:pStyle w:val="BodyText"/>
       </w:pPr>
       <w:r>
-        <w:t xml:space="preserve">AUPRC was 0.302 for embedded logistic regression and 0.298 for feature-vector XGBoost, compared with the cohort’s positive-rate reference of 0.175. Brier scores were 0.137 and 0.138, respectively. Calibration varied by model and method of assessment; the individual-level logistic calibration slope for embedded logistic regression was 0.97. Full calibration summaries, precision–recall curves, and descriptive operating points appear in Multimedia Appendix 1, sections S3–S4, S10, and S13.</w:t>
+        <w:t xml:space="preserve">AUPRC was 0.302 for embedded logistic regression and 0.298 for feature-vector XGBoost, compared with the cohort’s positive-rate reference of 0.175. Brier scores were 0.137 and 0.138, respectively. Calibration varied by model and method of assessment; the individual-level logistic calibration slope for embedded logistic regression was 0.97. Full calibration summaries, precision–recall curves, and descriptive operating points appear in Multimedia Appendix 1, sections S2–S3, S9, and S12.</w:t>
       </w:r>
     </w:p>
     <w:bookmarkEnd w:id="36"/>
@@ -3722,7 +3722,7 @@
         <w:pStyle w:val="BodyText"/>
       </w:pPr>
       <w:r>
-        <w:t xml:space="preserve">Logistic regression was the strongest embedded classifier for all 4 encoders, with ROC AUCs ranging from 0.645 to 0.657. Psychiatric history and medication burden remained the largest contributors across encoders: permutation reduced logistic-regression ROC AUC by 0.027–0.030 and 0.022–0.034, respectively (Figure 3). Feature-vector coefficient rankings also emphasized psychiatric burden, including suicidality, severe depression coding, insomnia, and anxiety. Detailed importance, dimensionality, and encoder analyses are in Multimedia Appendix 1, sections S2, S5, and S13.</w:t>
+        <w:t xml:space="preserve">Logistic regression was the strongest embedded classifier for all 4 encoders, with ROC AUCs ranging from 0.645 to 0.657. Psychiatric history and medication burden remained the largest contributors across encoders: permutation reduced logistic-regression ROC AUC by 0.027–0.030 and 0.022–0.034, respectively (Figure 3). Feature-vector coefficient rankings also emphasized psychiatric burden, including suicidality, severe depression coding, insomnia, and anxiety. Detailed importance, dimensionality, and encoder analyses are in Multimedia Appendix 1, sections S1, S4, and S12.</w:t>
       </w:r>
     </w:p>
     <w:p>
@@ -3797,7 +3797,7 @@
           <w:iCs/>
           <w:i/>
         </w:rPr>
-        <w:t xml:space="preserve">Encoder robustness for embedded logistic regression. A: ROC AUC with bootstrap 95% CIs. B: change in ROC AUC after permutation of psychiatric history or medication burden, with paired bootstrap 95% CIs. Encoders are bge-small-en-v1.5, bge-en-icl, Qwen3-Embedding-4B, and Qwen3-Embedding-8B. Complete encoder estimates appear in Multimedia Appendix 1, Table S16.</w:t>
+        <w:t xml:space="preserve">Encoder robustness for embedded logistic regression. A: ROC AUC with bootstrap 95% CIs. B: change in ROC AUC after permutation of psychiatric history or medication burden, with paired bootstrap 95% CIs. Encoders are bge-small-en-v1.5, bge-en-icl, Qwen3-Embedding-4B, and Qwen3-Embedding-8B. Complete encoder estimates appear in Multimedia Appendix 1, Table S15.</w:t>
       </w:r>
     </w:p>
     <w:bookmarkEnd w:id="38"/>
@@ -3815,7 +3815,7 @@
         <w:pStyle w:val="FirstParagraph"/>
       </w:pPr>
       <w:r>
-        <w:t xml:space="preserve">At k = 50, plain cosine retrieval achieved an ROC AUC of 0.594 (95% CI 0.578–0.610). Random retrieval yielded 0.499 and farthest retrieval 0.432. Neighborhood size mattered more than the similarity metric (Figure 4). Discrimination rose with k and was flat from roughly 300 neighbors onward. At its best k, importance-weighted retrieval reached 0.625 (95% CI 0.610–0.641) and plain cosine 0.618 (95% CI 0.602–0.634). The paired difference between the 2 metrics was 0.007 (95% CI −0.001 to 0.014). The best retrieval result over every k and exponent was still lower than feature-vector XGBoost by 0.024 (95% CI 0.012–0.036) and lower than embedded logistic regression by 0.032 (95% CI 0.022–0.043). Because the best k was chosen on test patients, these maxima are optimistic. Using all 34,063 training patients as neighbors, with no k chosen, gave 0.624 (Multimedia Appendix 1, section S7).</w:t>
+        <w:t xml:space="preserve">At k = 50, plain cosine retrieval achieved an ROC AUC of 0.594 (95% CI 0.578–0.610). Random retrieval yielded 0.499 and farthest retrieval 0.432. Neighborhood size mattered more than the similarity metric (Figure 4). Discrimination rose with k and was flat from roughly 300 neighbors onward. At its best k, importance-weighted retrieval reached 0.625 (95% CI 0.610–0.641) and plain cosine 0.618 (95% CI 0.602–0.634). The paired difference between the 2 metrics was 0.007 (95% CI −0.001 to 0.014). The best retrieval result over every k and exponent was still lower than feature-vector XGBoost by 0.024 (95% CI 0.012–0.036) and lower than embedded logistic regression by 0.032 (95% CI 0.022–0.043). Because the best k was chosen on test patients, these maxima are optimistic. Using all 34,063 training patients as neighbors, with no k chosen, gave 0.624 (Multimedia Appendix 1, section S6).</w:t>
       </w:r>
     </w:p>
     <w:p>
@@ -3898,7 +3898,7 @@
         <w:pStyle w:val="BodyText"/>
       </w:pPr>
       <w:r>
-        <w:t xml:space="preserve">Of 240 subgroup contrasts, 24 survived multiplicity adjustment; 19 involved depression recurrence. Discrimination was higher with recurrent coding in all 10 models contrasted and lower with single-episode coding in 9. Performance was lower among never-married patients for 2 embedded classifiers and importance-weighted retrieval, and among patients aged 18–29 for feature-vector XGBoost. Plain cosine retrieval discriminated better in patients with severe coding. Sex contrasts did not show clear differences. White-minus-non-White ROC AUC differences were consistently positive (0.005–0.052), but none survived adjustment. For feature-vector logistic regression, individual-level calibration slopes were 0.98 in White patients and 0.79 in patients with other recorded racial categories. These findings do not establish equitable performance (Multimedia Appendix 1, section S10).</w:t>
+        <w:t xml:space="preserve">Of 240 subgroup contrasts, 24 survived multiplicity adjustment; 19 involved depression recurrence. Discrimination was higher with recurrent coding in all 10 models contrasted and lower with single-episode coding in 9. Performance was lower among never-married patients for 2 embedded classifiers and importance-weighted retrieval, and among patients aged 18–29 for feature-vector XGBoost. Plain cosine retrieval discriminated better in patients with severe coding. Sex contrasts did not show clear differences. White-minus-non-White ROC AUC differences were consistently positive (0.005–0.052), but none survived adjustment. For feature-vector logistic regression, individual-level calibration slopes were 0.98 in White patients and 0.79 in patients with other recorded racial categories. These findings do not establish equitable performance (Multimedia Appendix 1, section S9).</w:t>
       </w:r>
     </w:p>
     <w:bookmarkEnd w:id="40"/>
@@ -4257,7 +4257,7 @@
         <w:pStyle w:val="BodyText"/>
       </w:pPr>
       <w:r>
-        <w:t xml:space="preserve">3. Al-Harbi KS. Treatment-resistant depression: therapeutic trends, challenges, and future directions. Patient Prefer Adherence. 2012;6:369-388. doi:10.2147/PPA.S29716.</w:t>
+        <w:t xml:space="preserve">3. Al-Harbi KS. Treatment-resistant depression: therapeutic trends, challenges, and future directions. Patient Prefer Adherence. 2012;6:369-388. doi:10.2147/PPA.S29715.</w:t>
       </w:r>
     </w:p>
     <w:p>
@@ -4289,7 +4289,7 @@
         <w:pStyle w:val="BodyText"/>
       </w:pPr>
       <w:r>
-        <w:t xml:space="preserve">7. Chekroud AM, Zotti RJ, Shehzad Z, Gueorguieva R, Johnson MK, Trivedi MH, et al. Cross-trial prediction of treatment outcome in depression: a machine learning approach. Lancet Psychiatry. 2016;3(3):243-250. doi:10.1016/S2215-0366(15)00471-X.</w:t>
+        <w:t xml:space="preserve">7. Chekroud AM, Zotti RJ, Shehzad Z, Gueorguieva R, Johnson MK, Trivedi MH, et al. Cross-trial prediction of treatment outcome in depression: a machine learning approach. Lancet Psychiatry. 2016;3(3):243-250. doi:10.1016/S2214-0366(15)00471-X.</w:t>
       </w:r>
     </w:p>
     <w:p>

</xml_diff>

<commit_message>
research/TRD-EHR knn-across-embedders: the manuscript gains Nearest-Neighbor Retrieval Across Encoders and Figure 5, each encoder's weighted and plain retrieval at its best k against its own embedded logistic regression, no paired contrasts outside the primary encoder; M12, the TRIPOD 23a row and the paper README say the other three encoders are now reported; the sweep's working figure and the cover letter say logistic-regression-weighted; the cross-encoder figures get plain-number log ticks and a legend clear of the points; packet rebuilt
</commit_message>
<xml_diff>
--- a/research/TRD-EHR/paper1-trd-prediction/manuscript.docx
+++ b/research/TRD-EHR/paper1-trd-prediction/manuscript.docx
@@ -230,7 +230,7 @@
         <w:t xml:space="preserve"> </w:t>
       </w:r>
       <w:r>
-        <w:t xml:space="preserve">The outcome occurred in 7,455 patients (17.5%, 95% CI 17.2–17.9). In 8,516 test patients, embedded logistic regression achieved a receiver operating characteristic area under the curve (ROC AUC) of 0.657 (95% CI 0.643–0.672), compared with 0.649 (95% CI 0.634–0.664) for feature-vector XGBoost. The post hoc difference between these leading models was 0.008 (95% CI −0.003 to 0.019). Embeddings improved logistic regression by 0.028 (95% CI 0.017–0.039) but reduced discrimination for the 3 tree ensembles, by 0.013 (95% CI 0.001–0.026) to 0.022 (95% CI 0.011–0.033). Across encoders, embedded logistic regression reached 0.645 (95% CI 0.629–0.660) to 0.657. Permuting psychiatric history produced the largest loss for the primary encoder, 0.024 (95% CI 0.010–0.036) to 0.028 (95% CI 0.017–0.039) across classifiers; medication burden and prior treatment exposure also contributed. Permuting race/ethnicity or recorded social determinants changed ROC AUC by no more than 0.003, and every such interval included zero. Nearest-neighbor retrieval stayed below both leading classifiers at every neighborhood size. Importance-weighted retrieval reached 0.625 (95% CI 0.610–0.641) at 295 neighbors, a size chosen on the test patients. Randomly chosen neighbors reached 0.500 (2.5th–97.5th percentile across draws 0.484–0.515).</w:t>
+        <w:t xml:space="preserve">The outcome occurred in 7,455 patients (17.5%, 95% CI 17.2–17.9). In 8,516 test patients, embedded logistic regression achieved a receiver operating characteristic area under the curve (ROC AUC) of 0.657 (95% CI 0.643–0.672), compared with 0.649 (95% CI 0.634–0.664) for feature-vector XGBoost. The post hoc difference between these leading models was 0.008 (95% CI −0.003 to 0.019). Embeddings improved logistic regression by 0.028 (95% CI 0.017–0.039) but reduced discrimination for the 3 tree ensembles, by 0.013 (95% CI 0.001–0.026) to 0.022 (95% CI 0.011–0.033). Across encoders, embedded logistic regression reached 0.645 (95% CI 0.629–0.660) to 0.657. Permuting psychiatric history produced the largest loss for the primary encoder, 0.024 (95% CI 0.010–0.036) to 0.028 (95% CI 0.017–0.039) across classifiers; medication burden and prior treatment exposure also contributed. Permuting race/ethnicity or recorded social determinants changed ROC AUC by no more than 0.003, and every such interval included zero. Nearest-neighbor retrieval stayed below both leading classifiers at every neighborhood size. Logistic-regression-weighted retrieval reached 0.625 (95% CI 0.610–0.641) at 295 neighbors, a size chosen on the test patients. Randomly chosen neighbors reached 0.500 (2.5th–97.5th percentile across draws 0.484–0.515).</w:t>
       </w:r>
     </w:p>
     <w:p>
@@ -580,7 +580,7 @@
         <w:pStyle w:val="BodyText"/>
       </w:pPr>
       <w:r>
-        <w:t xml:space="preserve">We also predicted each test patient’s outcome from its nearest training-set neighbors. Test patients served only as queries. The risk score was the similarity-weighted mean outcome of the k most similar training patients (Equation 2). Similarity was measured in 2 ways. Plain cosine similarity used the raw embeddings. Importance-weighted cosine similarity first standardized each embedding dimension with the embedded logistic regression’s own scaler. It then weighted each dimension by its share of that model’s absolute coefficients (Equation 1). The coefficients were fitted on training patients only, so no test outcome entered a risk score.</w:t>
+        <w:t xml:space="preserve">We also predicted each test patient’s outcome from its nearest training-set neighbors. Test patients served only as queries. The risk score was the similarity-weighted mean outcome of the k most similar training patients (Equation 2). Similarity was measured in 2 ways. Plain cosine similarity used the raw embeddings. Logistic-regression-weighted cosine similarity first standardized each embedding dimension with the embedded logistic regression’s own scaler. It then weighted each dimension by its share of that model’s absolute coefficients (Equation 1). The coefficients were fitted on training patients only, so no test outcome entered a risk score.</w:t>
       </w:r>
     </w:p>
     <w:p>
@@ -1543,7 +1543,7 @@
     </w:p>
     <w:bookmarkEnd w:id="32"/>
     <w:bookmarkEnd w:id="33"/>
-    <w:bookmarkStart w:id="41" w:name="results"/>
+    <w:bookmarkStart w:id="43" w:name="results"/>
     <w:p>
       <w:pPr>
         <w:pStyle w:val="Heading1"/>
@@ -3867,7 +3867,7 @@
         <w:pStyle w:val="FirstParagraph"/>
       </w:pPr>
       <w:r>
-        <w:t xml:space="preserve">Random retrieval stayed at chance at every k: at its best k, 32,720, it reached 0.500 (2.5th–97.5th percentile across draws 0.484–0.515). Farthest retrieval yielded 0.432 (95% CI 0.416–0.449). Neighborhood size mattered more than the similarity metric (Figure 4). Discrimination rose with k up to a few hundred neighbors. From k = 261 onward, importance-weighted retrieval stayed inside the interval at its best k. Plain cosine retrieval peaked at k = 757 and then drifted down, to 0.605 (95% CI 0.589–0.620) at k = 16,988. At its best k, importance-weighted retrieval reached 0.625 (95% CI 0.610–0.641) at k = 295, and plain cosine 0.618 (95% CI 0.602–0.634) at k = 757. They exceeded random retrieval by 0.125 (95% CI 0.103–0.147) and 0.118 (95% CI 0.096–0.140), respectively. The paired difference between the 2 metrics was 0.007 (95% CI −0.001 to 0.014). The best retrieval result over every k and exponent was importance-weighted retrieval with α = 2 at k = 1,090, 0.625 (95% CI 0.610–0.640). It was still lower than feature-vector XGBoost by 0.024 (95% CI 0.012–0.036) and lower than embedded logistic regression by 0.032 (95% CI 0.022–0.043). Because the best k was chosen on test patients, these maxima are optimistic. Using all 34,063 training patients as neighbors, with no k chosen, gave 0.624 (95% CI 0.607–0.639) for importance-weighted retrieval and 0.608 (95% CI 0.592–0.624) for plain cosine (Multimedia Appendix 1, section S6).</w:t>
+        <w:t xml:space="preserve">Random retrieval stayed at chance at every k: at its best k, 32,720, it reached 0.500 (2.5th–97.5th percentile across draws 0.484–0.515). Farthest retrieval yielded 0.432 (95% CI 0.416–0.449). Neighborhood size mattered more than the similarity metric (Figure 4). Discrimination rose with k up to a few hundred neighbors. From k = 261 onward, logistic-regression-weighted retrieval stayed inside the interval at its best k. Plain cosine retrieval peaked at k = 757 and then drifted down, to 0.605 (95% CI 0.589–0.620) at k = 16,988. At its best k, logistic-regression-weighted retrieval reached 0.625 (95% CI 0.610–0.641) at k = 295, and plain cosine 0.618 (95% CI 0.602–0.634) at k = 757. They exceeded random retrieval by 0.125 (95% CI 0.103–0.147) and 0.118 (95% CI 0.096–0.140), respectively. The paired difference between the 2 metrics was 0.007 (95% CI −0.001 to 0.014). The best retrieval result over every k and exponent was logistic-regression-weighted retrieval with α = 2 at k = 1,090, 0.625 (95% CI 0.610–0.640). It was still lower than feature-vector XGBoost by 0.024 (95% CI 0.012–0.036) and lower than embedded logistic regression by 0.032 (95% CI 0.022–0.043). Because the best k was chosen on test patients, these maxima are optimistic. Using all 34,063 training patients as neighbors, with no k chosen, gave 0.624 (95% CI 0.607–0.639) for logistic-regression-weighted retrieval and 0.608 (95% CI 0.592–0.624) for plain cosine (Multimedia Appendix 1, section S6).</w:t>
       </w:r>
     </w:p>
     <w:p>
@@ -3942,20 +3942,129 @@
           <w:iCs/>
           <w:i/>
         </w:rPr>
-        <w:t xml:space="preserve">Retrieval discrimination by neighborhood size. ROC AUC in 8,516 test patients at every k from 1 to 34,063 for importance-weighted and plain cosine retrieval, with bootstrap 95% bands, and for random retrieval with uniform weights, as the mean across 1,000 draws within the 2.5th–97.5th percentile of the draws. Points mark each arm’s best k, chosen on the test patients, so the values there are optimistic; the random arm’s best k is noise. Horizontal lines mark the 2 leading trained classifiers. Curves use α = 1; the maxima under α = 1, 2, and 5 agreed within 0.002.</w:t>
-      </w:r>
-    </w:p>
-    <w:p>
-      <w:pPr>
-        <w:pStyle w:val="BodyText"/>
-      </w:pPr>
-      <w:r>
-        <w:t xml:space="preserve">Subgroup analyses scored each retrieval arm at its best k. Of 240 subgroup contrasts, 23 survived multiplicity adjustment; 19 involved depression recurrence. Discrimination was higher with recurrent coding in all 10 models contrasted and lower with single-episode coding in 9. Performance was lower among never-married patients for 2 embedded classifiers and importance-weighted retrieval, and among patients aged 18–29 for feature-vector XGBoost. Sex contrasts did not show clear differences. White-minus-non-White ROC AUC differences were consistently positive (0.005–0.046), but none survived adjustment. For feature-vector logistic regression, individual-level calibration slopes were 0.98 (95% CI 0.85–1.11) in White patients and 0.79 (95% CI 0.56–1.02) in patients with other recorded racial categories. These findings do not establish equitable performance (Multimedia Appendix 1, section S9).</w:t>
+        <w:t xml:space="preserve">Retrieval discrimination by neighborhood size. ROC AUC in 8,516 test patients at every k from 1 to 34,063 for logistic-regression-weighted and plain cosine retrieval, with bootstrap 95% bands, and for random retrieval with uniform weights, as the mean across 1,000 draws within the 2.5th–97.5th percentile of the draws. Points mark each arm’s best k, chosen on the test patients, so the values there are optimistic; the random arm’s best k is noise. Horizontal lines mark the 2 leading trained classifiers. Curves use α = 1; the maxima under α = 1, 2, and 5 agreed within 0.002.</w:t>
+      </w:r>
+    </w:p>
+    <w:p>
+      <w:pPr>
+        <w:pStyle w:val="BodyText"/>
+      </w:pPr>
+      <w:r>
+        <w:t xml:space="preserve">Subgroup analyses scored each retrieval arm at its best k. Of 240 subgroup contrasts, 23 survived multiplicity adjustment; 19 involved depression recurrence. Discrimination was higher with recurrent coding in all 10 models contrasted and lower with single-episode coding in 9. Performance was lower among never-married patients for 2 embedded classifiers and logistic-regression-weighted retrieval, and among patients aged 18–29 for feature-vector XGBoost. Sex contrasts did not show clear differences. White-minus-non-White ROC AUC differences were consistently positive (0.005–0.046), but none survived adjustment. For feature-vector logistic regression, individual-level calibration slopes were 0.98 (95% CI 0.85–1.11) in White patients and 0.79 (95% CI 0.56–1.02) in patients with other recorded racial categories. These findings do not establish equitable performance (Multimedia Appendix 1, section S9).</w:t>
       </w:r>
     </w:p>
     <w:bookmarkEnd w:id="40"/>
-    <w:bookmarkEnd w:id="41"/>
-    <w:bookmarkStart w:id="47" w:name="discussion"/>
+    <w:bookmarkStart w:id="42" w:name="X396e520dd6495a396736514718baa51d7644dd0"/>
+    <w:p>
+      <w:pPr>
+        <w:pStyle w:val="Heading2"/>
+      </w:pPr>
+      <w:r>
+        <w:t xml:space="preserve">Nearest-Neighbor Retrieval Across Encoders</w:t>
+      </w:r>
+    </w:p>
+    <w:p>
+      <w:pPr>
+        <w:pStyle w:val="FirstParagraph"/>
+      </w:pPr>
+      <w:r>
+        <w:t xml:space="preserve">We repeated the neighborhood-size sweep for the other 3 encoders under the same rules. Each encoder’s logistic-regression-weighted similarity used the coefficients of that encoder’s own embedded logistic regression. Each metric was read at its own best k under α = 1, chosen on the test patients, so these maxima are optimistic. Retrieval stayed below embedded logistic regression for every encoder (Figure 5).</w:t>
+      </w:r>
+    </w:p>
+    <w:p>
+      <w:pPr>
+        <w:pStyle w:val="BodyText"/>
+      </w:pPr>
+      <w:r>
+        <w:t xml:space="preserve">Logistic-regression-weighted retrieval at its best k reached 0.606 (95% CI 0.590–0.620) at k = 579 for bge-small-en-v1.5, 0.631 (95% CI 0.616–0.646) at k = 1,519 for bge-en-icl, 0.623 (95% CI 0.607–0.639) at k = 684 for Qwen3-Embedding-4B, and 0.625 (95% CI 0.610–0.641) at k = 295 for Qwen3-Embedding-8B. Embedded logistic regression reached 0.645 (95% CI 0.629–0.660), 0.655 (95% CI 0.641–0.670), 0.655 (95% CI 0.641–0.670), and 0.657 (95% CI 0.643–0.672) for the same encoders. For each encoder, the upper bound of the retrieval interval lay below the logistic-regression estimate. Paired contrasts were computed for the primary encoder only.</w:t>
+      </w:r>
+    </w:p>
+    <w:p>
+      <w:pPr>
+        <w:pStyle w:val="BodyText"/>
+      </w:pPr>
+      <w:r>
+        <w:t xml:space="preserve">Plain cosine retrieval peaked at k = 1,243, 413, 493, and 757 for the same 4 encoders. It reached 0.602 (95% CI 0.586–0.618), 0.620 (95% CI 0.605–0.637), 0.621 (95% CI 0.605–0.637), and 0.618 (95% CI 0.602–0.634), lower than the weighted metric for every encoder. Only the primary encoder’s difference was tested, 0.007 (95% CI −0.001 to 0.014). Every best k for either metric lay between 295 and 1,519. Using all 34,063 training patients as neighbors, weighted retrieval gave 0.617 (95% CI 0.600–0.633) to 0.629 (95% CI 0.614–0.645) for the 3 larger encoders. For bge-small-en-v1.5 it fell to 0.580 (95% CI 0.565–0.595), the only encoder whose weighted curve declined at large k.</w:t>
+      </w:r>
+    </w:p>
+    <w:p>
+      <w:pPr>
+        <w:pStyle w:val="BodyText"/>
+      </w:pPr>
+      <w:r>
+        <w:drawing>
+          <wp:inline>
+            <wp:extent cx="5486400" cy="2294312"/>
+            <wp:effectExtent b="0" l="0" r="0" t="0"/>
+            <wp:docPr descr="" title="" id="1" name="Picture"/>
+            <a:graphic>
+              <a:graphicData uri="http://schemas.openxmlformats.org/drawingml/2006/picture">
+                <pic:pic>
+                  <pic:nvPicPr>
+                    <pic:cNvPr descr="../results/cross_embedder_retrieval/cross_embedder_sweep.png" id="0" name="Picture"/>
+                    <pic:cNvPicPr>
+                      <a:picLocks noChangeArrowheads="1" noChangeAspect="1"/>
+                    </pic:cNvPicPr>
+                  </pic:nvPicPr>
+                  <pic:blipFill>
+                    <a:blip r:embed="rId41"/>
+                    <a:stretch>
+                      <a:fillRect/>
+                    </a:stretch>
+                  </pic:blipFill>
+                  <pic:spPr bwMode="auto">
+                    <a:xfrm>
+                      <a:off x="0" y="0"/>
+                      <a:ext cx="5486400" cy="2294312"/>
+                    </a:xfrm>
+                    <a:prstGeom prst="rect">
+                      <a:avLst/>
+                    </a:prstGeom>
+                    <a:noFill/>
+                    <a:ln w="9525">
+                      <a:noFill/>
+                      <a:headEnd/>
+                      <a:tailEnd/>
+                    </a:ln>
+                  </pic:spPr>
+                </pic:pic>
+              </a:graphicData>
+            </a:graphic>
+          </wp:inline>
+        </w:drawing>
+      </w:r>
+    </w:p>
+    <w:p>
+      <w:pPr>
+        <w:pStyle w:val="BodyText"/>
+      </w:pPr>
+      <w:r>
+        <w:rPr>
+          <w:bCs/>
+          <w:b/>
+          <w:iCs/>
+          <w:i/>
+        </w:rPr>
+        <w:t xml:space="preserve">Figure 5.</w:t>
+      </w:r>
+      <w:r>
+        <w:rPr>
+          <w:iCs/>
+          <w:i/>
+        </w:rPr>
+        <w:t xml:space="preserve"> </w:t>
+      </w:r>
+      <w:r>
+        <w:rPr>
+          <w:iCs/>
+          <w:i/>
+        </w:rPr>
+        <w:t xml:space="preserve">Retrieval discrimination by neighborhood size for the 4 encoders. ROC AUC in 8,516 test patients at every k from 1 to 34,063, under α = 1, for logistic-regression-weighted (left panel) and plain cosine retrieval (right panel). Each encoder’s weights come from its own embedded logistic regression. Points mark each encoder’s best k, chosen on the test patients, so the values there are optimistic. The dotted line marks chance. Bootstrap bands are omitted for legibility; Figure 4 draws them for the primary encoder.</w:t>
+      </w:r>
+    </w:p>
+    <w:bookmarkEnd w:id="42"/>
+    <w:bookmarkEnd w:id="43"/>
+    <w:bookmarkStart w:id="49" w:name="discussion"/>
     <w:p>
       <w:pPr>
         <w:pStyle w:val="Heading1"/>
@@ -3964,7 +4073,7 @@
         <w:t xml:space="preserve">Discussion</w:t>
       </w:r>
     </w:p>
-    <w:bookmarkStart w:id="42" w:name="principal-findings"/>
+    <w:bookmarkStart w:id="44" w:name="principal-findings"/>
     <w:p>
       <w:pPr>
         <w:pStyle w:val="Heading2"/>
@@ -3997,8 +4106,8 @@
         <w:t xml:space="preserve">The predictive signal was concentrated in familiar aspects of clinical history. Psychiatric comorbidity, medication burden, and prior treatment contributed most to embedded discrimination, while feature-vector models highlighted related markers of illness complexity. Nearest-neighbor analyses showed that embedding proximity was associated with the outcome: randomly chosen neighbors gave chance discrimination at every neighborhood size. Retrieval still fell short of the trained classifiers at every neighborhood size, and the number of neighbors mattered more than how similarity was weighted. Taken together, these findings suggest that embeddings reorganized useful information already recorded in the EHR; they do not demonstrate a new measure of treatment resistance.</w:t>
       </w:r>
     </w:p>
-    <w:bookmarkEnd w:id="42"/>
-    <w:bookmarkStart w:id="43" w:name="comparison-with-prior-work"/>
+    <w:bookmarkEnd w:id="44"/>
+    <w:bookmarkStart w:id="45" w:name="comparison-with-prior-work"/>
     <w:p>
       <w:pPr>
         <w:pStyle w:val="Heading2"/>
@@ -4023,8 +4132,8 @@
         <w:t xml:space="preserve">The present contribution is the direct comparison of practical representation pipelines under a shared cohort, prediction time, and test split. It does not set a performance ceiling for EHR prediction. Adding independently informative measurements may improve prediction, as may better outcome ascertainment. Re-encoding existing records should therefore be judged by incremental performance, reproducibility, and implementation burden rather than model size alone.</w:t>
       </w:r>
     </w:p>
-    <w:bookmarkEnd w:id="43"/>
-    <w:bookmarkStart w:id="44" w:name="clinical-interpretation-and-limitations"/>
+    <w:bookmarkEnd w:id="45"/>
+    <w:bookmarkStart w:id="46" w:name="clinical-interpretation-and-limitations"/>
     <w:p>
       <w:pPr>
         <w:pStyle w:val="Heading2"/>
@@ -4057,8 +4166,8 @@
         <w:t xml:space="preserve">The minimal change after race/ethnicity or social-determinant permutation is useful but does not establish fairness. These fields may be incompletely recorded, related information may remain in other predictors, and the outcome depends on access to treatment [28,29]. The subgroup analyses were limited by small event counts and broad racial aggregation, with unresolved differences in discrimination and calibration. Similarly, concept permutation measures sensitivity to altered inputs rather than a causal contribution; correlated fields and implausible combinations after permutation limit attribution.</w:t>
       </w:r>
     </w:p>
-    <w:bookmarkEnd w:id="44"/>
-    <w:bookmarkStart w:id="45" w:name="implications-and-next-steps"/>
+    <w:bookmarkEnd w:id="46"/>
+    <w:bookmarkStart w:id="47" w:name="implications-and-next-steps"/>
     <w:p>
       <w:pPr>
         <w:pStyle w:val="Heading2"/>
@@ -4075,8 +4184,8 @@
         <w:t xml:space="preserve">The current findings are useful, but the results do not support clinical deployment. The next steps are to validate the switching phenotype against treatment histories and symptom change, then evaluate frozen pipelines in temporal and external cohorts. Evaluation should compare embeddings with compact psychiatric-history, medication, and utilization baselines and report precision–recall performance, individual-level calibration, subgroup errors, and decision-analytic net benefit at prespecified thresholds. However, for an embedding pipeline to justify its added complexity, it should improve prediction, transportability, or clinical workflow beyond a simpler model. It is also possible that a more clinically informative prediction target may be as impactful for future investigations as a more elaborate representation of the case embedding.</w:t>
       </w:r>
     </w:p>
-    <w:bookmarkEnd w:id="45"/>
-    <w:bookmarkStart w:id="46" w:name="conclusions"/>
+    <w:bookmarkEnd w:id="47"/>
+    <w:bookmarkStart w:id="48" w:name="conclusions"/>
     <w:p>
       <w:pPr>
         <w:pStyle w:val="Heading2"/>
@@ -4093,9 +4202,9 @@
         <w:t xml:space="preserve">At the index antidepressant prescription, structured feature vectors and narrative embeddings provided modest discrimination for a subsequent treatment-switching proxy for TRD, without demonstrated superiority of the strongest embedded model. Performance depended on the classifier. Progress toward clinical use requires better validation of the outcome and evidence that prediction improves decisions across patients and health systems.</w:t>
       </w:r>
     </w:p>
-    <w:bookmarkEnd w:id="46"/>
-    <w:bookmarkEnd w:id="47"/>
-    <w:bookmarkStart w:id="48" w:name="acknowledgments"/>
+    <w:bookmarkEnd w:id="48"/>
+    <w:bookmarkEnd w:id="49"/>
+    <w:bookmarkStart w:id="50" w:name="acknowledgments"/>
     <w:p>
       <w:pPr>
         <w:pStyle w:val="Heading1"/>
@@ -4112,8 +4221,8 @@
         <w:t xml:space="preserve">ChatGPT (OpenAI) assisted with language editing and organization of the manuscript and supplement. The authors are responsible for the final content.</w:t>
       </w:r>
     </w:p>
-    <w:bookmarkEnd w:id="48"/>
-    <w:bookmarkStart w:id="49" w:name="funding"/>
+    <w:bookmarkEnd w:id="50"/>
+    <w:bookmarkStart w:id="51" w:name="funding"/>
     <w:p>
       <w:pPr>
         <w:pStyle w:val="Heading1"/>
@@ -4130,8 +4239,8 @@
         <w:t xml:space="preserve">This work was funded by the William K. Warren Foundation. No other funding agency in the public, commercial, or not-for-profit sectors supported this research. M. Ferguson was supported by a graduate assistantship from the Laureate Institute for Brain Research while enrolled as a graduate student at The University of Tulsa. The funder had no role in the design of the study, the analysis or interpretation of the data, the writing of the manuscript, or the decision to submit it for publication.</w:t>
       </w:r>
     </w:p>
-    <w:bookmarkEnd w:id="49"/>
-    <w:bookmarkStart w:id="50" w:name="conflicts-of-interest"/>
+    <w:bookmarkEnd w:id="51"/>
+    <w:bookmarkStart w:id="52" w:name="conflicts-of-interest"/>
     <w:p>
       <w:pPr>
         <w:pStyle w:val="Heading1"/>
@@ -4148,8 +4257,8 @@
         <w:t xml:space="preserve">None declared.</w:t>
       </w:r>
     </w:p>
-    <w:bookmarkEnd w:id="50"/>
-    <w:bookmarkStart w:id="51" w:name="data-availability"/>
+    <w:bookmarkEnd w:id="52"/>
+    <w:bookmarkStart w:id="53" w:name="data-availability"/>
     <w:p>
       <w:pPr>
         <w:pStyle w:val="Heading1"/>
@@ -4166,8 +4275,8 @@
         <w:t xml:space="preserve">The EHR data cannot be shared publicly. Analysis code is available at https://github.com/Pirate-Hunter-Zoro/TRD-EHR. Fitted model objects are not distributed because they are derived from nonshareable patient data.</w:t>
       </w:r>
     </w:p>
-    <w:bookmarkEnd w:id="51"/>
-    <w:bookmarkStart w:id="52" w:name="authors-contributions"/>
+    <w:bookmarkEnd w:id="53"/>
+    <w:bookmarkStart w:id="54" w:name="authors-contributions"/>
     <w:p>
       <w:pPr>
         <w:pStyle w:val="Heading1"/>
@@ -4184,8 +4293,8 @@
         <w:t xml:space="preserve">MF designed and implemented the analysis pipeline, performed all modeling and statistical analysis, produced all figures and tables, including those in Multimedia Appendix 1, and wrote the Methods and Results. MP directed the project, supervised its scientific design and interpretation, and wrote the rest of the manuscript. KLF prepared the upstream clinical data, including the treatment-resistant depression labels and the antidepressant index dates that define the cohort and the outcome. RK, SS, and DP provided methodological feedback and guidance on the analysis and its interpretation throughout. All authors reviewed and approved the final manuscript.</w:t>
       </w:r>
     </w:p>
-    <w:bookmarkEnd w:id="52"/>
-    <w:bookmarkStart w:id="53" w:name="protocol-and-registration"/>
+    <w:bookmarkEnd w:id="54"/>
+    <w:bookmarkStart w:id="55" w:name="protocol-and-registration"/>
     <w:p>
       <w:pPr>
         <w:pStyle w:val="Heading1"/>
@@ -4202,8 +4311,8 @@
         <w:t xml:space="preserve">No study protocol was prepared, and the study was not registered. The completed TRIPOD+AI checklist is provided as a separate submission document [19].</w:t>
       </w:r>
     </w:p>
-    <w:bookmarkEnd w:id="53"/>
-    <w:bookmarkStart w:id="54" w:name="abbreviations"/>
+    <w:bookmarkEnd w:id="55"/>
+    <w:bookmarkStart w:id="56" w:name="abbreviations"/>
     <w:p>
       <w:pPr>
         <w:pStyle w:val="Heading1"/>
@@ -4260,8 +4369,8 @@
         <w:t xml:space="preserve">TRIPOD+AI: Transparent Reporting of a Multivariable Prediction Model for Individual Prognosis or Diagnosis plus Artificial Intelligence</w:t>
       </w:r>
     </w:p>
-    <w:bookmarkEnd w:id="54"/>
-    <w:bookmarkStart w:id="55" w:name="multimedia-appendix-1"/>
+    <w:bookmarkEnd w:id="56"/>
+    <w:bookmarkStart w:id="57" w:name="multimedia-appendix-1"/>
     <w:p>
       <w:pPr>
         <w:pStyle w:val="Heading1"/>
@@ -4278,8 +4387,8 @@
         <w:t xml:space="preserve">Supplementary methods, predictor inventory, supporting analyses, and extended results for the comparison of structured feature vectors and narrative embeddings.</w:t>
       </w:r>
     </w:p>
-    <w:bookmarkEnd w:id="55"/>
-    <w:bookmarkStart w:id="56" w:name="references"/>
+    <w:bookmarkEnd w:id="57"/>
+    <w:bookmarkStart w:id="58" w:name="references"/>
     <w:p>
       <w:pPr>
         <w:pStyle w:val="Heading1"/>
@@ -4520,7 +4629,7 @@
         <w:t xml:space="preserve">29. Alegría M, Chatterji P, Wells K, Cao Z, Chen CN, Takeuchi D, et al. Disparity in depression treatment among racial and ethnic minority populations in the United States. Psychiatr Serv. 2008;59(11):1264-1272. doi:10.1176/ps.2008.59.11.1264.</w:t>
       </w:r>
     </w:p>
-    <w:bookmarkEnd w:id="56"/>
+    <w:bookmarkEnd w:id="58"/>
     <w:sectPr>
       <w:pgSz w:h="15840" w:w="12240"/>
       <w:pgMar w:bottom="1440" w:footer="708" w:gutter="0" w:header="708" w:left="1800" w:right="1800" w:top="1440"/>

</xml_diff>